<commit_message>
Grammar of Creation draft: add John's Granddaddy note; regenerate Word copy
</commit_message>
<xml_diff>
--- a/_implementation-notes/grammar-of-creation-draft-2026-06-16.docx
+++ b/_implementation-notes/grammar-of-creation-draft-2026-06-16.docx
@@ -43,7 +43,7 @@
         <w:t xml:space="preserve">_implementation-notes/</w:t>
       </w:r>
       <w:r>
-        <w:t xml:space="preserve"> convention — never mirrored to prod). Drafted for John's review; placement (Vol 1 Exploration vs. Vol 5 framing essay) undecided. Branches A and B (see end) are NOT yet written; Branch C (the inclusion-criteria stress-test) IS included below as an appendix.</w:t>
+        <w:t xml:space="preserve"> convention — never mirrored to prod). Drafted for John's review; placement (Vol 1 Exploration vs. Vol 5 framing essay) undecided. Branches A and B (see end) are NOT yet written; Branch C (the inclusion-criteria stress-test) IS included below as an appendix. Granddaddy note filled in by John 2026-06-16 (his own words).</w:t>
       </w:r>
     </w:p>
     <w:p>
@@ -850,51 +850,26 @@
     </w:p>
     <w:p>
       <w:pPr>
-        <w:pBdr>
-          <w:left w:val="single" w:color="B0B7C0" w:sz="12" w:space="8"/>
-        </w:pBdr>
-        <w:spacing w:after="80"/>
-        <w:ind w:left="480"/>
-      </w:pPr>
-      <w:r>
-        <w:rPr>
-          <w:b/>
-          <w:bCs/>
-        </w:rPr>
-        <w:t xml:space="preserve">A word from your Granddaddy</w:t>
-      </w:r>
-      <w:r>
-        <w:t xml:space="preserve"> — </w:t>
-      </w:r>
-      <w:r>
-        <w:rPr>
-          <w:i/>
-          <w:iCs/>
-        </w:rPr>
-        <w:t xml:space="preserve">[placeholder for John]</w:t>
-      </w:r>
-      <w:r>
-        <w:t xml:space="preserve">: a short reflection in your own voice would seat this beautifully — the moment in your life when the lawfulness of the world first struck you as </w:t>
-      </w:r>
-      <w:r>
-        <w:rPr>
-          <w:i/>
-          <w:iCs/>
-        </w:rPr>
-        <w:t xml:space="preserve">spoken</w:t>
-      </w:r>
-      <w:r>
-        <w:t xml:space="preserve"> rather than merely </w:t>
-      </w:r>
-      <w:r>
-        <w:rPr>
-          <w:i/>
-          <w:iCs/>
-        </w:rPr>
-        <w:t xml:space="preserve">there</w:t>
-      </w:r>
-      <w:r>
-        <w:t xml:space="preserve"> (a night sky, a classroom, a worship service). Left blank deliberately rather than inventing a memory.</w:t>
+        <w:spacing w:after="140"/>
+      </w:pPr>
+      <w:r>
+        <w:rPr>
+          <w:b/>
+          <w:bCs/>
+          <w:i/>
+          <w:iCs/>
+        </w:rPr>
+        <w:t xml:space="preserve">A word from your Granddaddy.</w:t>
+      </w:r>
+      <w:r>
+        <w:t xml:space="preserve"> </w:t>
+      </w:r>
+      <w:r>
+        <w:rPr>
+          <w:i/>
+          <w:iCs/>
+        </w:rPr>
+        <w:t xml:space="preserve">This notion has been with me since I first started studying scripture seriously. I'm always looking for connections and the deeper things behind the surface we see. I find this not just interesting, but it tugs at my heart and makes me smile.</w:t>
       </w:r>
     </w:p>
     <w:p>

</xml_diff>

<commit_message>
Vol 5: add 'The Grammar of Creation' speculative framing essay after the Introduction (nav-wired; count held)
</commit_message>
<xml_diff>
--- a/_implementation-notes/grammar-of-creation-draft-2026-06-16.docx
+++ b/_implementation-notes/grammar-of-creation-draft-2026-06-16.docx
@@ -43,7 +43,17 @@
         <w:t xml:space="preserve">_implementation-notes/</w:t>
       </w:r>
       <w:r>
-        <w:t xml:space="preserve"> convention — never mirrored to prod). Drafted for John's review; placement (Vol 1 Exploration vs. Vol 5 framing essay) undecided. Branches A and B (see end) are NOT yet written; Branch C (the inclusion-criteria stress-test) IS included below as an appendix. Granddaddy note filled in by John 2026-06-16 (his own words).</w:t>
+        <w:t xml:space="preserve"> convention — never mirrored to prod). Drafted for John's review; placement (Vol 1 Exploration vs. Vol 5 framing essay) undecided. </w:t>
+      </w:r>
+      <w:r>
+        <w:rPr>
+          <w:b/>
+          <w:bCs/>
+        </w:rPr>
+        <w:t xml:space="preserve">PLACEMENT DECIDED (John, 2026-06-16): goes in the Vol 5 introduction area, as a Speculative framing essay. KEEP Branch C (the inclusion-criteria stress-test) as an appendix; DROP Branches A and B (not to be written).</w:t>
+      </w:r>
+      <w:r>
+        <w:t xml:space="preserve"> Granddaddy note filled in by John 2026-06-16 (his own words). This working draft is the source; the live Vol 5 chapter is the cleaned version (frontmatter, no draft scaffolding, no branch stubs).</w:t>
       </w:r>
     </w:p>
     <w:p>
@@ -1808,91 +1818,14 @@
     </w:p>
     <w:p>
       <w:pPr>
-        <w:pBdr>
-          <w:bottom w:val="single" w:color="999999" w:sz="6" w:space="4"/>
-        </w:pBdr>
-        <w:spacing w:after="100" w:before="100"/>
-      </w:pPr>
-      <w:r>
-        <w:t xml:space="preserve"/>
-      </w:r>
-    </w:p>
-    <w:p>
-      <w:pPr>
-        <w:pStyle w:val="Heading1"/>
-      </w:pPr>
-      <w:r>
-        <w:t xml:space="preserve">Branches not yet written (available on request)</w:t>
-      </w:r>
-    </w:p>
-    <w:p>
-      <w:pPr>
-        <w:pStyle w:val="ListParagraph"/>
-        <w:numPr>
-          <w:ilvl w:val="0"/>
-          <w:numId w:val="2"/>
-        </w:numPr>
-        <w:spacing w:after="60"/>
-      </w:pPr>
-      <w:r>
-        <w:rPr>
-          <w:b/>
-          <w:bCs/>
-        </w:rPr>
-        <w:t xml:space="preserve">Branch A — "Two sets of spoken laws" as its own framing essay</w:t>
-      </w:r>
-      <w:r>
-        <w:t xml:space="preserve"> (sibling to </w:t>
-      </w:r>
-      <w:r>
-        <w:rPr>
-          <w:i/>
-          <w:iCs/>
-        </w:rPr>
-        <w:t xml:space="preserve">Properties of Spiritual Law</w:t>
-      </w:r>
-      <w:r>
-        <w:t xml:space="preserve">): develops the physical-law / spiritual-law symmetry into structural support for the whole catalog, including a shared account of miracles ("a miracle is not the breaking of a law but the Lawgiver speaking a new word over a particular case"). ~1.5–2 pp; Vol 1 framing essay.</w:t>
-      </w:r>
-    </w:p>
-    <w:p>
-      <w:pPr>
-        <w:pStyle w:val="ListParagraph"/>
-        <w:numPr>
-          <w:ilvl w:val="0"/>
-          <w:numId w:val="2"/>
-        </w:numPr>
-        <w:spacing w:after="60"/>
-      </w:pPr>
-      <w:r>
-        <w:rPr>
-          <w:b/>
-          <w:bCs/>
-        </w:rPr>
-        <w:t xml:space="preserve">Branch B — The Logos / Wisdom material, dug in deep</w:t>
-      </w:r>
-      <w:r>
-        <w:t xml:space="preserve">: John 1's first-century </w:t>
-      </w:r>
-      <w:r>
-        <w:rPr>
-          <w:i/>
-          <w:iCs/>
-        </w:rPr>
-        <w:t xml:space="preserve">Logos</w:t>
-      </w:r>
-      <w:r>
-        <w:t xml:space="preserve"> background; Prov. 8 / Job 28 </w:t>
-      </w:r>
-      <w:r>
-        <w:rPr>
-          <w:i/>
-          <w:iCs/>
-        </w:rPr>
-        <w:t xml:space="preserve">chokmah</w:t>
-      </w:r>
-      <w:r>
-        <w:t xml:space="preserve"> as the ordering, delighting intelligence at creation; the fathers (Justin, Athanasius, Augustine) on "creation through the Logos"; 1 Cor. 1:24 ("Christ… the wisdom of God"). The best guard against the deism drift. ~1–1.5 pp; chapter-middle expansion or a Vol 5 note.</w:t>
+        <w:spacing w:after="140"/>
+      </w:pPr>
+      <w:r>
+        <w:rPr>
+          <w:i/>
+          <w:iCs/>
+        </w:rPr>
+        <w:t xml:space="preserve">(Branches A and B were considered and dropped per John, 2026-06-16; the chapter stands on its body plus the Branch C stress-test.)</w:t>
       </w:r>
     </w:p>
     <w:sectPr>

</xml_diff>